<commit_message>
Table S2 기계 물성 = AFM 값 (PTFE 1.8 · SDCP 9.0 GPa) — 사용자 결정
표는 논문 자신의 Fig 2g / S6–S7 과 일치하는 값으로 간다.  대기 표시 각주는
표에서 뺐고(투고 상태), 재압밀은 D3 의 실행 항목으로 남겼다 — 지금 분석한
침대는 PTFE 0.30 · SDCP 23.6 GPa 세대이므로 그 런이 끝나야 표와 시뮬이
일치한다.  D3 에 파급도 적어 뒀다: 재압밀하면 Table S3 의 두께 · porosity ·
면적용량과 σ_e 가 같이 움직이고, 비의 이동이 8팔 산포(±0.7 %) 안이면 무시
가능으로 닫힌다.

각주 번호 재부여 (c 삭제 → 옛 d 가 c).

Co-Authored-By: Claude Opus 5 <noreply@anthropic.com>
Claude-Session: https://claude.ai/code/session_019HKnbzGsY9U5Gyw4qGqqzA
</commit_message>
<xml_diff>
--- a/docs/manuscript_draft/DEM_methodology_and_tables_v1.docx
+++ b/docs/manuscript_draft/DEM_methodology_and_tables_v1.docx
@@ -2872,7 +2872,7 @@
                 <w:sz w:val="21"/>
                 <w:szCs w:val="21"/>
               </w:rPr>
-              <w:t xml:space="preserve">—</w:t>
+              <w:t xml:space="preserve">1.8</w:t>
             </w:r>
           </w:p>
         </w:tc>
@@ -2922,16 +2922,7 @@
                 <w:sz w:val="21"/>
                 <w:szCs w:val="21"/>
               </w:rPr>
-              <w:t xml:space="preserve">This work (Figure S6, S7) </w:t>
-            </w:r>
-            <w:r>
-              <w:rPr>
-                <w:rFonts w:ascii="Times New Roman" w:cs="Times New Roman" w:eastAsia="Times New Roman" w:hAnsi="Times New Roman"/>
-                <w:sz w:val="21"/>
-                <w:szCs w:val="21"/>
-                <w:vertAlign w:val="superscript"/>
-              </w:rPr>
-              <w:t xml:space="preserve">c</w:t>
+              <w:t xml:space="preserve">This work (Figure S6, S7)</w:t>
             </w:r>
           </w:p>
         </w:tc>
@@ -3255,7 +3246,7 @@
                 <w:sz w:val="21"/>
                 <w:szCs w:val="21"/>
               </w:rPr>
-              <w:t xml:space="preserve">—</w:t>
+              <w:t xml:space="preserve">9.0</w:t>
             </w:r>
           </w:p>
         </w:tc>
@@ -3305,16 +3296,7 @@
                 <w:sz w:val="21"/>
                 <w:szCs w:val="21"/>
               </w:rPr>
-              <w:t xml:space="preserve">This work (Figure 2g) </w:t>
-            </w:r>
-            <w:r>
-              <w:rPr>
-                <w:rFonts w:ascii="Times New Roman" w:cs="Times New Roman" w:eastAsia="Times New Roman" w:hAnsi="Times New Roman"/>
-                <w:sz w:val="21"/>
-                <w:szCs w:val="21"/>
-                <w:vertAlign w:val="superscript"/>
-              </w:rPr>
-              <w:t xml:space="preserve">c</w:t>
+              <w:t xml:space="preserve">This work (Figure 2g)</w:t>
             </w:r>
           </w:p>
         </w:tc>
@@ -3579,7 +3561,7 @@
                 <w:szCs w:val="21"/>
                 <w:vertAlign w:val="superscript"/>
               </w:rPr>
-              <w:t xml:space="preserve">d</w:t>
+              <w:t xml:space="preserve">c</w:t>
             </w:r>
           </w:p>
         </w:tc>
@@ -3686,30 +3668,6 @@
           <w:vertAlign w:val="superscript"/>
         </w:rPr>
         <w:t xml:space="preserve">c</w:t>
-      </w:r>
-      <w:r>
-        <w:rPr>
-          <w:rFonts w:ascii="Times New Roman" w:cs="Times New Roman" w:eastAsia="Times New Roman" w:hAnsi="Times New Roman"/>
-          <w:sz w:val="21"/>
-          <w:szCs w:val="21"/>
-        </w:rPr>
-        <w:t xml:space="preserve"> Left blank pending re-compaction at the AFM moduli reported in Figure 2g and Figures S6–S7; the microstructures analysed here were built before those values were adopted.</w:t>
-      </w:r>
-    </w:p>
-    <w:p>
-      <w:pPr>
-        <w:spacing w:after="60"/>
-        <w:ind w:left="200"/>
-        <w:jc w:val="both"/>
-      </w:pPr>
-      <w:r>
-        <w:rPr>
-          <w:rFonts w:ascii="Times New Roman" w:cs="Times New Roman" w:eastAsia="Times New Roman" w:hAnsi="Times New Roman"/>
-          <w:sz w:val="21"/>
-          <w:szCs w:val="21"/>
-          <w:vertAlign w:val="superscript"/>
-        </w:rPr>
-        <w:t xml:space="preserve">d</w:t>
       </w:r>
       <w:r>
         <w:rPr>
@@ -5988,33 +5946,15 @@
           <w:sz w:val="21"/>
           <w:szCs w:val="21"/>
         </w:rPr>
-        <w:t xml:space="preserve">Table S2 — 기계 물성은 비워 두었다 (각주 c).</w:t>
-      </w:r>
-      <w:r>
-        <w:rPr>
-          <w:rFonts w:ascii="Times New Roman" w:cs="Times New Roman" w:eastAsia="Times New Roman" w:hAnsi="Times New Roman"/>
-          <w:sz w:val="21"/>
-          <w:szCs w:val="21"/>
-        </w:rPr>
-        <w:t xml:space="preserve"> 지금 미세구조는 PTFE 0.30 GPa · SDCP 23.6 GPa 로 압밀한 것인데, Figure 2g 와 Figure S6–S7 이 보고하는 값은 1.8 GPa 와 9.0 GPa 다.  방법론 표에 옛 값을 적으면 그림과 어긋나고, AFM 값을 적으면 실제로 돌린 것과 달라진다.  ⇒ </w:t>
-      </w:r>
-      <w:r>
-        <w:rPr>
-          <w:rFonts w:ascii="Times New Roman" w:cs="Times New Roman" w:eastAsia="Times New Roman" w:hAnsi="Times New Roman"/>
-          <w:b/>
-          <w:bCs/>
-          <w:sz w:val="21"/>
-          <w:szCs w:val="21"/>
-        </w:rPr>
-        <w:t xml:space="preserve">AFM 값으로 다시 압밀한 뒤 채운다.</w:t>
-      </w:r>
-      <w:r>
-        <w:rPr>
-          <w:rFonts w:ascii="Times New Roman" w:cs="Times New Roman" w:eastAsia="Times New Roman" w:hAnsi="Times New Roman"/>
-          <w:sz w:val="21"/>
-          <w:szCs w:val="21"/>
-        </w:rPr>
-        <w:t xml:space="preserve">  ⚠ 그때 Table S3 의 두께 · porosity · 면적용량과 σ_e 도 같이 움직인다 — 침대 기하가 바뀌기 때문이다.  전도도 비의 이동이 8팔 산포(±0.7 %) 안이면 무시 가능으로 닫히고, 벗어나면 그 값들도 새 침대 것으로 갱신한다.</w:t>
+        <w:t xml:space="preserve">Table S2 의 기계 물성은 AFM 값(PTFE 1.8 · SDCP 9.0 GPa)으로 적었다 — 투고 전 그 값으로 재압밀할 것.</w:t>
+      </w:r>
+      <w:r>
+        <w:rPr>
+          <w:rFonts w:ascii="Times New Roman" w:cs="Times New Roman" w:eastAsia="Times New Roman" w:hAnsi="Times New Roman"/>
+          <w:sz w:val="21"/>
+          <w:szCs w:val="21"/>
+        </w:rPr>
+        <w:t xml:space="preserve"> 지금 분석한 미세구조는 PTFE 0.30 · SDCP 23.6 GPa 로 압밀한 세대이므로, 그대로 두면 표와 실제로 돌린 것이 어긋난다.  ⚠ 재압밀하면 Table S3 의 두께 · porosity · 면적용량과 σ_e 도 같이 움직인다 (침대 기하가 바뀐다).  전도도 비의 이동이 8팔 산포(±0.7 %) 안이면 무시 가능으로 닫히고, 벗어나면 그 값들도 새 침대 것으로 갱신한다.</w:t>
       </w:r>
     </w:p>
     <w:p>

</xml_diff>

<commit_message>
D14 — sigma_AM 출처 명시 + AM_S/AM_P 라벨 확인 항목
1.0e-2 S/cm = sigma_e 스케일링법칙의 코퍼스 적합 endpoint (sigma_S ~ 9.13 을
10 으로 반올림).  문헌(Alabdali 2023 · Wang 2018)은 NMC bulk 5e-5 S/cm =
우리 값의 1/200 (CL-50).

신규 확인 항목: 이 침대의 AM 은 전부 AM_S(작은/단결정) 로 찍혀 10 mS/cm 를
받았는데 원고는 powder 를 polycrystalline NCM811 (r=2.5 um) 로 기술한다.
우리 규약에서 다결정은 AM_P = 5 mS/cm — 2배 차이.  근거: CL-37 상별 원장에
AM_P 행이 없고 AM_S 24.1M 셀뿐이다.

Co-Authored-By: Claude Opus 5 <noreply@anthropic.com>
Claude-Session: https://claude.ai/code/session_019HKnbzGsY9U5Gyw4qGqqzA
</commit_message>
<xml_diff>
--- a/docs/manuscript_draft/DEM_methodology_and_tables_v1.docx
+++ b/docs/manuscript_draft/DEM_methodology_and_tables_v1.docx
@@ -6447,7 +6447,164 @@
           <w:sz w:val="21"/>
           <w:szCs w:val="21"/>
         </w:rPr>
-        <w:t xml:space="preserve">(코퍼스 적합 endpoint)이지 NCM811 고유 전도도가 아니다.  문헌 두 출처는 이 값의 약 1/200 을 준다 — 물성값처럼 소개하는 문장은 쓰지 말 것.  (ii) </w:t>
+        <w:t xml:space="preserve">(코퍼스 적합 endpoint)이지 NCM811 고유 전도도가 아니다.  문헌 두 출처(Alabdali 2023 · Wang 2018)는 NMC bulk 를 5 × 10</w:t>
+      </w:r>
+      <w:r>
+        <w:rPr>
+          <w:rFonts w:ascii="Times New Roman" w:cs="Times New Roman" w:eastAsia="Times New Roman" w:hAnsi="Times New Roman"/>
+          <w:sz w:val="21"/>
+          <w:szCs w:val="21"/>
+          <w:vertAlign w:val="superscript"/>
+        </w:rPr>
+        <w:t xml:space="preserve">−5</w:t>
+      </w:r>
+      <w:r>
+        <w:rPr>
+          <w:rFonts w:ascii="Times New Roman" w:cs="Times New Roman" w:eastAsia="Times New Roman" w:hAnsi="Times New Roman"/>
+          <w:sz w:val="21"/>
+          <w:szCs w:val="21"/>
+        </w:rPr>
+        <w:t xml:space="preserve"> S cm</w:t>
+      </w:r>
+      <w:r>
+        <w:rPr>
+          <w:rFonts w:ascii="Times New Roman" w:cs="Times New Roman" w:eastAsia="Times New Roman" w:hAnsi="Times New Roman"/>
+          <w:sz w:val="21"/>
+          <w:szCs w:val="21"/>
+          <w:vertAlign w:val="superscript"/>
+        </w:rPr>
+        <w:t xml:space="preserve">−1</w:t>
+      </w:r>
+      <w:r>
+        <w:rPr>
+          <w:rFonts w:ascii="Times New Roman" w:cs="Times New Roman" w:eastAsia="Times New Roman" w:hAnsi="Times New Roman"/>
+          <w:sz w:val="21"/>
+          <w:szCs w:val="21"/>
+        </w:rPr>
+        <w:t xml:space="preserve"> 로 준다 = 이 값의 약 </w:t>
+      </w:r>
+      <w:r>
+        <w:rPr>
+          <w:rFonts w:ascii="Times New Roman" w:cs="Times New Roman" w:eastAsia="Times New Roman" w:hAnsi="Times New Roman"/>
+          <w:b/>
+          <w:bCs/>
+          <w:sz w:val="21"/>
+          <w:szCs w:val="21"/>
+        </w:rPr>
+        <w:t xml:space="preserve">1/200</w:t>
+      </w:r>
+      <w:r>
+        <w:rPr>
+          <w:rFonts w:ascii="Times New Roman" w:cs="Times New Roman" w:eastAsia="Times New Roman" w:hAnsi="Times New Roman"/>
+          <w:sz w:val="21"/>
+          <w:szCs w:val="21"/>
+        </w:rPr>
+        <w:t xml:space="preserve"> — 물성값처럼 소개하는 문장은 쓰지 말 것.  정확히는 σ</w:t>
+      </w:r>
+      <w:r>
+        <w:rPr>
+          <w:rFonts w:ascii="Times New Roman" w:cs="Times New Roman" w:eastAsia="Times New Roman" w:hAnsi="Times New Roman"/>
+          <w:sz w:val="21"/>
+          <w:szCs w:val="21"/>
+          <w:vertAlign w:val="subscript"/>
+        </w:rPr>
+        <w:t xml:space="preserve">e</w:t>
+      </w:r>
+      <w:r>
+        <w:rPr>
+          <w:rFonts w:ascii="Times New Roman" w:cs="Times New Roman" w:eastAsia="Times New Roman" w:hAnsi="Times New Roman"/>
+          <w:sz w:val="21"/>
+          <w:szCs w:val="21"/>
+        </w:rPr>
+        <w:t xml:space="preserve"> 스케일링법칙의 endpoint σ</w:t>
+      </w:r>
+      <w:r>
+        <w:rPr>
+          <w:rFonts w:ascii="Times New Roman" w:cs="Times New Roman" w:eastAsia="Times New Roman" w:hAnsi="Times New Roman"/>
+          <w:sz w:val="21"/>
+          <w:szCs w:val="21"/>
+          <w:vertAlign w:val="subscript"/>
+        </w:rPr>
+        <w:t xml:space="preserve">S</w:t>
+      </w:r>
+      <w:r>
+        <w:rPr>
+          <w:rFonts w:ascii="Times New Roman" w:cs="Times New Roman" w:eastAsia="Times New Roman" w:hAnsi="Times New Roman"/>
+          <w:sz w:val="21"/>
+          <w:szCs w:val="21"/>
+        </w:rPr>
+        <w:t xml:space="preserve"> ≈ 9.13 을 10 으로 반올림한 값이다.  ⚠ </w:t>
+      </w:r>
+      <w:r>
+        <w:rPr>
+          <w:rFonts w:ascii="Times New Roman" w:cs="Times New Roman" w:eastAsia="Times New Roman" w:hAnsi="Times New Roman"/>
+          <w:b/>
+          <w:bCs/>
+          <w:sz w:val="21"/>
+          <w:szCs w:val="21"/>
+        </w:rPr>
+        <w:t xml:space="preserve">확인할 것</w:t>
+      </w:r>
+      <w:r>
+        <w:rPr>
+          <w:rFonts w:ascii="Times New Roman" w:cs="Times New Roman" w:eastAsia="Times New Roman" w:hAnsi="Times New Roman"/>
+          <w:sz w:val="21"/>
+          <w:szCs w:val="21"/>
+        </w:rPr>
+        <w:t xml:space="preserve">: 이 침대의 AM 은 전부 </w:t>
+      </w:r>
+      <w:r>
+        <w:rPr>
+          <w:rFonts w:ascii="Times New Roman" w:cs="Times New Roman" w:eastAsia="Times New Roman" w:hAnsi="Times New Roman"/>
+          <w:b/>
+          <w:bCs/>
+          <w:sz w:val="21"/>
+          <w:szCs w:val="21"/>
+        </w:rPr>
+        <w:t xml:space="preserve">AM_S</w:t>
+      </w:r>
+      <w:r>
+        <w:rPr>
+          <w:rFonts w:ascii="Times New Roman" w:cs="Times New Roman" w:eastAsia="Times New Roman" w:hAnsi="Times New Roman"/>
+          <w:sz w:val="21"/>
+          <w:szCs w:val="21"/>
+        </w:rPr>
+        <w:t xml:space="preserve">(작은/단결정) 클래스로 찍혀 10 mS cm</w:t>
+      </w:r>
+      <w:r>
+        <w:rPr>
+          <w:rFonts w:ascii="Times New Roman" w:cs="Times New Roman" w:eastAsia="Times New Roman" w:hAnsi="Times New Roman"/>
+          <w:sz w:val="21"/>
+          <w:szCs w:val="21"/>
+          <w:vertAlign w:val="superscript"/>
+        </w:rPr>
+        <w:t xml:space="preserve">−1</w:t>
+      </w:r>
+      <w:r>
+        <w:rPr>
+          <w:rFonts w:ascii="Times New Roman" w:cs="Times New Roman" w:eastAsia="Times New Roman" w:hAnsi="Times New Roman"/>
+          <w:sz w:val="21"/>
+          <w:szCs w:val="21"/>
+        </w:rPr>
+        <w:t xml:space="preserve"> 를 받았는데, 원고는 powder 를 </w:t>
+      </w:r>
+      <w:r>
+        <w:rPr>
+          <w:rFonts w:ascii="Times New Roman" w:cs="Times New Roman" w:eastAsia="Times New Roman" w:hAnsi="Times New Roman"/>
+          <w:b/>
+          <w:bCs/>
+          <w:sz w:val="21"/>
+          <w:szCs w:val="21"/>
+        </w:rPr>
+        <w:t xml:space="preserve">polycrystalline</w:t>
+      </w:r>
+      <w:r>
+        <w:rPr>
+          <w:rFonts w:ascii="Times New Roman" w:cs="Times New Roman" w:eastAsia="Times New Roman" w:hAnsi="Times New Roman"/>
+          <w:sz w:val="21"/>
+          <w:szCs w:val="21"/>
+        </w:rPr>
+        <w:t xml:space="preserve"> NCM811 (</w:t>
       </w:r>
       <w:r>
         <w:rPr>
@@ -6457,7 +6614,15 @@
           <w:sz w:val="21"/>
           <w:szCs w:val="21"/>
         </w:rPr>
-        <w:t xml:space="preserve">σ</w:t>
+        <w:t xml:space="preserve">r</w:t>
+      </w:r>
+      <w:r>
+        <w:rPr>
+          <w:rFonts w:ascii="Times New Roman" w:cs="Times New Roman" w:eastAsia="Times New Roman" w:hAnsi="Times New Roman"/>
+          <w:sz w:val="21"/>
+          <w:szCs w:val="21"/>
+        </w:rPr>
+        <w:t xml:space="preserve"> = 2.5 μm) 로 기술한다.  우리 규약에서 다결정은 AM</w:t>
       </w:r>
       <w:r>
         <w:rPr>
@@ -6466,6 +6631,14 @@
           <w:szCs w:val="21"/>
           <w:vertAlign w:val="subscript"/>
         </w:rPr>
+        <w:t xml:space="preserve">P = 5 mS cm^−1^ 다 — **2배 차이**라 의도한 것인지 확인이 필요하다 (AM 이 나르는 전류는 SBE 기준 약 12 % → σ</w:t>
+      </w:r>
+      <w:r>
+        <w:rPr>
+          <w:rFonts w:ascii="Times New Roman" w:cs="Times New Roman" w:eastAsia="Times New Roman" w:hAnsi="Times New Roman"/>
+          <w:sz w:val="21"/>
+          <w:szCs w:val="21"/>
+        </w:rPr>
         <w:t xml:space="preserve">e</w:t>
       </w:r>
       <w:r>
@@ -6473,111 +6646,34 @@
           <w:rFonts w:ascii="Times New Roman" w:cs="Times New Roman" w:eastAsia="Times New Roman" w:hAnsi="Times New Roman"/>
           <w:sz w:val="21"/>
           <w:szCs w:val="21"/>
-        </w:rPr>
-        <w:t xml:space="preserve">(VGCF) 100 S cm</w:t>
-      </w:r>
-      <w:r>
-        <w:rPr>
-          <w:rFonts w:ascii="Times New Roman" w:cs="Times New Roman" w:eastAsia="Times New Roman" w:hAnsi="Times New Roman"/>
-          <w:sz w:val="21"/>
-          <w:szCs w:val="21"/>
-          <w:vertAlign w:val="superscript"/>
-        </w:rPr>
-        <w:t xml:space="preserve">−1</w:t>
-      </w:r>
-      <w:r>
-        <w:rPr>
-          <w:rFonts w:ascii="Times New Roman" w:cs="Times New Roman" w:eastAsia="Times New Roman" w:hAnsi="Times New Roman"/>
-          <w:sz w:val="21"/>
-          <w:szCs w:val="21"/>
-        </w:rPr>
-        <w:t xml:space="preserve"> 은 </w:t>
-      </w:r>
-      <w:r>
-        <w:rPr>
-          <w:rFonts w:ascii="Times New Roman" w:cs="Times New Roman" w:eastAsia="Times New Roman" w:hAnsi="Times New Roman"/>
-          <w:b/>
-          <w:bCs/>
-          <w:sz w:val="21"/>
-          <w:szCs w:val="21"/>
-        </w:rPr>
-        <w:t xml:space="preserve">압분 분말값</w:t>
-      </w:r>
-      <w:r>
-        <w:rPr>
-          <w:rFonts w:ascii="Times New Roman" w:cs="Times New Roman" w:eastAsia="Times New Roman" w:hAnsi="Times New Roman"/>
-          <w:sz w:val="21"/>
-          <w:szCs w:val="21"/>
-        </w:rPr>
-        <w:t xml:space="preserve">(0.012 Ω cm)이고 단섬유 고유값(≈10</w:t>
-      </w:r>
-      <w:r>
-        <w:rPr>
-          <w:rFonts w:ascii="Times New Roman" w:cs="Times New Roman" w:eastAsia="Times New Roman" w:hAnsi="Times New Roman"/>
-          <w:sz w:val="21"/>
-          <w:szCs w:val="21"/>
-          <w:vertAlign w:val="superscript"/>
-        </w:rPr>
-        <w:t xml:space="preserve">4</w:t>
-      </w:r>
-      <w:r>
-        <w:rPr>
-          <w:rFonts w:ascii="Times New Roman" w:cs="Times New Roman" w:eastAsia="Times New Roman" w:hAnsi="Times New Roman"/>
-          <w:sz w:val="21"/>
-          <w:szCs w:val="21"/>
-        </w:rPr>
-        <w:t xml:space="preserve"> S cm</w:t>
-      </w:r>
-      <w:r>
-        <w:rPr>
-          <w:rFonts w:ascii="Times New Roman" w:cs="Times New Roman" w:eastAsia="Times New Roman" w:hAnsi="Times New Roman"/>
-          <w:sz w:val="21"/>
-          <w:szCs w:val="21"/>
-          <w:vertAlign w:val="superscript"/>
-        </w:rPr>
-        <w:t xml:space="preserve">−1</w:t>
-      </w:r>
-      <w:r>
-        <w:rPr>
-          <w:rFonts w:ascii="Times New Roman" w:cs="Times New Roman" w:eastAsia="Times New Roman" w:hAnsi="Times New Roman"/>
-          <w:sz w:val="21"/>
-          <w:szCs w:val="21"/>
-        </w:rPr>
-        <w:t xml:space="preserve">)이 아니다.  복셀이 닿은 섬유를 융합시켜 섬유-섬유 접촉저항을 안 담으므로 접촉저항이 포함된 쪽을 쓰는 것이 맞다 — 단섬유값을 쓰면 접촉저항이 두 번 소거된다.  0.15 μm 복셀에서 섬유가 한 칸 굵기로 그려지므로 원/정사각 면적비 (π/4) 로 재척도해 78.5 S cm</w:t>
-      </w:r>
-      <w:r>
-        <w:rPr>
-          <w:rFonts w:ascii="Times New Roman" w:cs="Times New Roman" w:eastAsia="Times New Roman" w:hAnsi="Times New Roman"/>
-          <w:sz w:val="21"/>
-          <w:szCs w:val="21"/>
-          <w:vertAlign w:val="superscript"/>
-        </w:rPr>
-        <w:t xml:space="preserve">−1</w:t>
-      </w:r>
-      <w:r>
-        <w:rPr>
-          <w:rFonts w:ascii="Times New Roman" w:cs="Times New Roman" w:eastAsia="Times New Roman" w:hAnsi="Times New Roman"/>
-          <w:sz w:val="21"/>
-          <w:szCs w:val="21"/>
-        </w:rPr>
-        <w:t xml:space="preserve"> 를 쓴다 (축방향 컨덕턴스 보존).  이 두 문장은 리뷰어가 물으면 그때 넣으면 된다.  (iii) 표의 공백은 각각 — 두께 · porosity · 면적용량 = 재압밀 대기(D3) / coverage · 접촉수 · 연결률 = 0.15 μm 재추출 대기(D4) / σ</w:t>
-      </w:r>
-      <w:r>
-        <w:rPr>
-          <w:rFonts w:ascii="Times New Roman" w:cs="Times New Roman" w:eastAsia="Times New Roman" w:hAnsi="Times New Roman"/>
-          <w:sz w:val="21"/>
-          <w:szCs w:val="21"/>
           <w:vertAlign w:val="subscript"/>
         </w:rPr>
-        <w:t xml:space="preserve">ion</w:t>
-      </w:r>
-      <w:r>
-        <w:rPr>
-          <w:rFonts w:ascii="Times New Roman" w:cs="Times New Roman" w:eastAsia="Times New Roman" w:hAnsi="Times New Roman"/>
-          <w:sz w:val="21"/>
-          <w:szCs w:val="21"/>
-        </w:rPr>
-        <w:t xml:space="preserve"> 전부 = Fig 2h 보정 대기(D12·D13).</w:t>
+        <w:t xml:space="preserve"> 절대값에 영향, 비에는 공통모드로 거의 상쇄).  (ii) *σ*</w:t>
+      </w:r>
+      <w:r>
+        <w:rPr>
+          <w:rFonts w:ascii="Times New Roman" w:cs="Times New Roman" w:eastAsia="Times New Roman" w:hAnsi="Times New Roman"/>
+          <w:sz w:val="21"/>
+          <w:szCs w:val="21"/>
+        </w:rPr>
+        <w:t xml:space="preserve">e</w:t>
+      </w:r>
+      <w:r>
+        <w:rPr>
+          <w:rFonts w:ascii="Times New Roman" w:cs="Times New Roman" w:eastAsia="Times New Roman" w:hAnsi="Times New Roman"/>
+          <w:sz w:val="21"/>
+          <w:szCs w:val="21"/>
+          <w:vertAlign w:val="subscript"/>
+        </w:rPr>
+        <w:t xml:space="preserve">(VGCF) 100 S cm^−1^ 은 **압분 분말값**(0.012 Ω cm)이고 단섬유 고유값(≈10^4^ S cm^−1^)이 아니다.  복셀이 닿은 섬유를 융합시켜 섬유-섬유 접촉저항을 안 담으므로 접촉저항이 포함된 쪽을 쓰는 것이 맞다 — 단섬유값을 쓰면 접촉저항이 두 번 소거된다.  0.15 μm 복셀에서 섬유가 한 칸 굵기로 그려지므로 원/정사각 면적비 (π/4) 로 재척도해 78.5 S cm^−1^ 를 쓴다 (축방향 컨덕턴스 보존).  이 두 문장은 리뷰어가 물으면 그때 넣으면 된다.  (iii) 표의 공백은 각각 — 두께 · porosity · 면적용량 = 재압밀 대기(D3) / coverage · 접촉수 · 연결률 = 0.15 μm 재추출 대기(D4) / σ</w:t>
+      </w:r>
+      <w:r>
+        <w:rPr>
+          <w:rFonts w:ascii="Times New Roman" w:cs="Times New Roman" w:eastAsia="Times New Roman" w:hAnsi="Times New Roman"/>
+          <w:sz w:val="21"/>
+          <w:szCs w:val="21"/>
+        </w:rPr>
+        <w:t xml:space="preserve">ion_ 전부 = Fig 2h 보정 대기(D12·D13).</w:t>
       </w:r>
     </w:p>
     <w:p>

</xml_diff>

<commit_message>
VGCF Source 라벨 정정 · E=10 GPa placeholder 명시 · Fig 2i 를 전자 축 앵커로 등재
· 섬유 직경 0.15 µm: `Experimental value` → `Supplier data`.  우리 측정이 아니라
  Showa Denko VGCF-H 카탈로그 값이다 (additives.py 주석).  SEM 실측이면 되돌릴 것.
· σ_e 100 S/cm: `Supplier data` → `Effective value`.  카탈로그 분말값은 0.012 Ω·cm
  = 83 S/cm 이고 100 은 자릿수를 맞춰 채택한 값이라 데이터시트를 그대로 옮긴 것이
  아니다 (CL-47).
· D14: VGCF 영률 10 GPa 가 **앵커 없는 placeholder** 임을 적었다 — 흑연화 탄소섬유
  축방향 영률은 10² GPa 급이다.  STEP3 σ 에는 안 들어가고 MPM 압밀 기하에만
  들어가며 로딩 3 wt% 라 영향이 작을 것으로 보지만 **미측정**이다.
· D13 확장: **Figure 2i 로 σ_e(SDCP) 도 앵커할 수 있다.**  같은 9:1 펠릿의 σ_e
  (LPSCl 0.30 → +PTFE 0.12 → +SDCP 1.53 ×10⁻⁷ S/cm)를 같은 RVE 로 재현하는 값을
  찾으면 전자·이온 두 축이 모두 이 논문 자신의 Figure 2 에 앵커된다.  지금 250 은
  논문 밖에서 온 가정값이다.  ⚠ SDCP 14.6 vol% 가 3D 구 퍼콜 문턱(≈16 vol%)
  근처라 결과가 퍼콜 여부에 민감하다.
</commit_message>
<xml_diff>
--- a/docs/manuscript_draft/DEM_methodology_and_tables_v1.docx
+++ b/docs/manuscript_draft/DEM_methodology_and_tables_v1.docx
@@ -2577,7 +2577,7 @@
                 <w:sz w:val="21"/>
                 <w:szCs w:val="21"/>
               </w:rPr>
-              <w:t xml:space="preserve">Experimental value</w:t>
+              <w:t xml:space="preserve">Supplier data</w:t>
             </w:r>
           </w:p>
         </w:tc>
@@ -2833,7 +2833,7 @@
                 <w:sz w:val="21"/>
                 <w:szCs w:val="21"/>
               </w:rPr>
-              <w:t xml:space="preserve">Supplier data</w:t>
+              <w:t xml:space="preserve">Effective value</w:t>
             </w:r>
           </w:p>
         </w:tc>
@@ -6665,7 +6665,7 @@
           <w:szCs w:val="21"/>
           <w:vertAlign w:val="subscript"/>
         </w:rPr>
-        <w:t xml:space="preserve">(VGCF) 100 S cm^−1^ 은 **압분 분말값**(0.012 Ω cm)이고 단섬유 고유값(≈10^4^ S cm^−1^)이 아니다.  복셀이 닿은 섬유를 융합시켜 섬유-섬유 접촉저항을 안 담으므로 접촉저항이 포함된 쪽을 쓰는 것이 맞다 — 단섬유값을 쓰면 접촉저항이 두 번 소거된다.  0.15 μm 복셀에서 섬유가 한 칸 굵기로 그려지므로 원/정사각 면적비 (π/4) 로 재척도해 78.5 S cm^−1^ 를 쓴다 (축방향 컨덕턴스 보존).  이 두 문장은 리뷰어가 물으면 그때 넣으면 된다.  (iii) 표의 공백은 각각 — 두께 · porosity · 면적용량 = 재압밀 대기(D3) / coverage · 접촉수 · 연결률 = 0.15 μm 재추출 대기(D4) / σ</w:t>
+        <w:t xml:space="preserve">(VGCF) 100 S cm^−1^ 은 **압분 분말값** 자릿수(Showa Denko VGCF-H 카탈로그 0.012 Ω cm ≈ 83 S cm^−1^)이고 단섬유 고유값(1e−4 Ω cm ≈ 10^4^ S cm^−1^)이 아니다.  ⚠ 코드값 100 은 카탈로그 83 을 그대로 쓴 것이 아니라 자릿수를 맞춰 채택한 값이라 Source 를 *Supplier data* → *Effective value* 로 고쳤다.  섬유 직경 0.15 μm 도 우리 측정이 아니라 같은 카탈로그 값이라 *Supplier data* 로 바꿨다 (SEM 으로 실측한 것이면 되돌릴 것).  ⚠ VGCF 영률 10 GPa 는 **앵커 없는 placeholder** 다 — 흑연화 탄소섬유의 축방향 영률은 10^2^ GPa 급이다.  STEP3 σ 계산에는 안 들어가고 MPM 압밀 기하에만 들어가며 로딩이 3 wt% 라 영향이 작을 것으로 보지만 **미측정**이다.  복셀이 닿은 섬유를 융합시켜 섬유-섬유 접촉저항을 안 담으므로 접촉저항이 포함된 쪽을 쓰는 것이 맞다 — 단섬유값을 쓰면 접촉저항이 두 번 소거된다.  0.15 μm 복셀에서 섬유가 한 칸 굵기로 그려지므로 원/정사각 면적비 (π/4) 로 재척도해 78.5 S cm^−1^ 를 쓴다 (축방향 컨덕턴스 보존).  이 두 문장은 리뷰어가 물으면 그때 넣으면 된다.  (iii) 표의 공백은 각각 — 두께 · porosity · 면적용량 = 재압밀 대기(D3) / coverage · 접촉수 · 연결률 = 0.15 μm 재추출 대기(D4) / σ</w:t>
       </w:r>
       <w:r>
         <w:rPr>
@@ -7703,7 +7703,145 @@
           <w:sz w:val="21"/>
           <w:szCs w:val="21"/>
         </w:rPr>
-        <w:t xml:space="preserve"> 를 재현하도록 맞춘다.  그렇게 얻은 상 전도도를 전극에 넣어 8팔을 다시 돌리면 이온 축이 </w:t>
+        <w:t xml:space="preserve"> 를 재현하도록 맞춘다.  ★ </w:t>
+      </w:r>
+      <w:r>
+        <w:rPr>
+          <w:rFonts w:ascii="Times New Roman" w:cs="Times New Roman" w:eastAsia="Times New Roman" w:hAnsi="Times New Roman"/>
+          <w:b/>
+          <w:bCs/>
+          <w:sz w:val="21"/>
+          <w:szCs w:val="21"/>
+        </w:rPr>
+        <w:t xml:space="preserve">같은 펠릿으로 전자 축도 앵커할 수 있다</w:t>
+      </w:r>
+      <w:r>
+        <w:rPr>
+          <w:rFonts w:ascii="Times New Roman" w:cs="Times New Roman" w:eastAsia="Times New Roman" w:hAnsi="Times New Roman"/>
+          <w:sz w:val="21"/>
+          <w:szCs w:val="21"/>
+        </w:rPr>
+        <w:t xml:space="preserve"> — Figure 2i 가 같은 9:1 펠릿의 σ</w:t>
+      </w:r>
+      <w:r>
+        <w:rPr>
+          <w:rFonts w:ascii="Times New Roman" w:cs="Times New Roman" w:eastAsia="Times New Roman" w:hAnsi="Times New Roman"/>
+          <w:sz w:val="21"/>
+          <w:szCs w:val="21"/>
+          <w:vertAlign w:val="subscript"/>
+        </w:rPr>
+        <w:t xml:space="preserve">e</w:t>
+      </w:r>
+      <w:r>
+        <w:rPr>
+          <w:rFonts w:ascii="Times New Roman" w:cs="Times New Roman" w:eastAsia="Times New Roman" w:hAnsi="Times New Roman"/>
+          <w:sz w:val="21"/>
+          <w:szCs w:val="21"/>
+        </w:rPr>
+        <w:t xml:space="preserve"> 를 준다 (LPSCl 0.30 → +PTFE 0.12 → +SDCP 1.53 × 10</w:t>
+      </w:r>
+      <w:r>
+        <w:rPr>
+          <w:rFonts w:ascii="Times New Roman" w:cs="Times New Roman" w:eastAsia="Times New Roman" w:hAnsi="Times New Roman"/>
+          <w:sz w:val="21"/>
+          <w:szCs w:val="21"/>
+          <w:vertAlign w:val="superscript"/>
+        </w:rPr>
+        <w:t xml:space="preserve">−7</w:t>
+      </w:r>
+      <w:r>
+        <w:rPr>
+          <w:rFonts w:ascii="Times New Roman" w:cs="Times New Roman" w:eastAsia="Times New Roman" w:hAnsi="Times New Roman"/>
+          <w:sz w:val="21"/>
+          <w:szCs w:val="21"/>
+        </w:rPr>
+        <w:t xml:space="preserve"> S cm</w:t>
+      </w:r>
+      <w:r>
+        <w:rPr>
+          <w:rFonts w:ascii="Times New Roman" w:cs="Times New Roman" w:eastAsia="Times New Roman" w:hAnsi="Times New Roman"/>
+          <w:sz w:val="21"/>
+          <w:szCs w:val="21"/>
+          <w:vertAlign w:val="superscript"/>
+        </w:rPr>
+        <w:t xml:space="preserve">−1</w:t>
+      </w:r>
+      <w:r>
+        <w:rPr>
+          <w:rFonts w:ascii="Times New Roman" w:cs="Times New Roman" w:eastAsia="Times New Roman" w:hAnsi="Times New Roman"/>
+          <w:sz w:val="21"/>
+          <w:szCs w:val="21"/>
+        </w:rPr>
+        <w:t xml:space="preserve">).  지금 σ</w:t>
+      </w:r>
+      <w:r>
+        <w:rPr>
+          <w:rFonts w:ascii="Times New Roman" w:cs="Times New Roman" w:eastAsia="Times New Roman" w:hAnsi="Times New Roman"/>
+          <w:sz w:val="21"/>
+          <w:szCs w:val="21"/>
+          <w:vertAlign w:val="subscript"/>
+        </w:rPr>
+        <w:t xml:space="preserve">e</w:t>
+      </w:r>
+      <w:r>
+        <w:rPr>
+          <w:rFonts w:ascii="Times New Roman" w:cs="Times New Roman" w:eastAsia="Times New Roman" w:hAnsi="Times New Roman"/>
+          <w:sz w:val="21"/>
+          <w:szCs w:val="21"/>
+        </w:rPr>
+        <w:t xml:space="preserve">(SDCP) = 250 S cm</w:t>
+      </w:r>
+      <w:r>
+        <w:rPr>
+          <w:rFonts w:ascii="Times New Roman" w:cs="Times New Roman" w:eastAsia="Times New Roman" w:hAnsi="Times New Roman"/>
+          <w:sz w:val="21"/>
+          <w:szCs w:val="21"/>
+          <w:vertAlign w:val="superscript"/>
+        </w:rPr>
+        <w:t xml:space="preserve">−1</w:t>
+      </w:r>
+      <w:r>
+        <w:rPr>
+          <w:rFonts w:ascii="Times New Roman" w:cs="Times New Roman" w:eastAsia="Times New Roman" w:hAnsi="Times New Roman"/>
+          <w:sz w:val="21"/>
+          <w:szCs w:val="21"/>
+        </w:rPr>
+        <w:t xml:space="preserve"> 는 논문 밖에서 온 가정값이므로, 같은 RVE 로 1.53 × 10</w:t>
+      </w:r>
+      <w:r>
+        <w:rPr>
+          <w:rFonts w:ascii="Times New Roman" w:cs="Times New Roman" w:eastAsia="Times New Roman" w:hAnsi="Times New Roman"/>
+          <w:sz w:val="21"/>
+          <w:szCs w:val="21"/>
+          <w:vertAlign w:val="superscript"/>
+        </w:rPr>
+        <w:t xml:space="preserve">−7</w:t>
+      </w:r>
+      <w:r>
+        <w:rPr>
+          <w:rFonts w:ascii="Times New Roman" w:cs="Times New Roman" w:eastAsia="Times New Roman" w:hAnsi="Times New Roman"/>
+          <w:sz w:val="21"/>
+          <w:szCs w:val="21"/>
+        </w:rPr>
+        <w:t xml:space="preserve"> 을 재현하는 값을 찾으면 </w:t>
+      </w:r>
+      <w:r>
+        <w:rPr>
+          <w:rFonts w:ascii="Times New Roman" w:cs="Times New Roman" w:eastAsia="Times New Roman" w:hAnsi="Times New Roman"/>
+          <w:b/>
+          <w:bCs/>
+          <w:sz w:val="21"/>
+          <w:szCs w:val="21"/>
+        </w:rPr>
+        <w:t xml:space="preserve">전자·이온 두 축이 모두 이 논문 자신의 Figure 2 에 앵커</w:t>
+      </w:r>
+      <w:r>
+        <w:rPr>
+          <w:rFonts w:ascii="Times New Roman" w:cs="Times New Roman" w:eastAsia="Times New Roman" w:hAnsi="Times New Roman"/>
+          <w:sz w:val="21"/>
+          <w:szCs w:val="21"/>
+        </w:rPr>
+        <w:t xml:space="preserve">된다.  ⚠ 단 SDCP 14.6 vol% 는 3D 구 퍼콜레이션 문턱(≈16 vol%) 근처라 결과가 퍼콜 여부에 민감하다 — 그 자체가 재볼 값어치가 있다.  그렇게 얻은 상 전도도를 전극에 넣어 8팔을 다시 돌리면 이온 축이 </w:t>
       </w:r>
       <w:r>
         <w:rPr>

</xml_diff>